<commit_message>
Write like a person: tidy typography, strip tool metadata, add standing instructions
Co-Authored-By: Claude Opus 5.5 <noreply@anthropic.com>
Claude-Session: https://claude.ai/code/session_01NjdMuB9buEkMmyf7HkyEWg
</commit_message>
<xml_diff>
--- a/applications/Master_Resume_New_Layout/Arunabha_Majumder_Resume.docx
+++ b/applications/Master_Resume_New_Layout/Arunabha_Majumder_Resume.docx
@@ -25,7 +25,7 @@
           <w:i w:val="0"/>
           <w:sz w:val="22"/>
         </w:rPr>
-        <w:t>Mechanical &amp; Robotics R&amp;D Engineer — Actuator Development, Controls &amp; Hardware Systems</w:t>
+        <w:t>Mechanical &amp; Robotics R&amp;D Engineer | Actuator Development, Controls &amp; Hardware Systems</w:t>
       </w:r>
     </w:p>
     <w:p>
@@ -103,7 +103,7 @@
         <w:rPr>
           <w:b/>
         </w:rPr>
-        <w:t>Research Engineer — Robotics &amp; Actuator Development (PhD Project: VIEXO)</w:t>
+        <w:t>Research Engineer | Robotics &amp; Actuator Development (PhD Project: VIEXO)</w:t>
       </w:r>
       <w:r>
         <w:t xml:space="preserve"> | 2023 – Present</w:t>
@@ -183,7 +183,7 @@
         <w:rPr>
           <w:b/>
         </w:rPr>
-        <w:t>M.Tech Researcher — Actuator Systems (Master's Thesis)</w:t>
+        <w:t>M.Tech Researcher | Actuator Systems (Master's Thesis)</w:t>
       </w:r>
       <w:r>
         <w:t xml:space="preserve"> | 2020 – 2022</w:t>
@@ -198,7 +198,7 @@
           <w:b w:val="0"/>
           <w:i/>
         </w:rPr>
-        <w:t>CSIR-Central Mechanical Engineering Research Institute (CMERI — National Laboratory, Govt. of India), Durgapur, India</w:t>
+        <w:t>CSIR-Central Mechanical Engineering Research Institute (CMERI | National Laboratory, Govt. of India), Durgapur, India</w:t>
       </w:r>
     </w:p>
     <w:p>
@@ -536,7 +536,7 @@
         <w:spacing w:after="40"/>
       </w:pPr>
       <w:r>
-        <w:t>Certified SolidWorks Associate (CSWA) — Mechanical Design</w:t>
+        <w:t>Certified SolidWorks Associate (CSWA) | Mechanical Design</w:t>
       </w:r>
     </w:p>
     <w:p>
@@ -561,7 +561,7 @@
         <w:spacing w:after="40"/>
       </w:pPr>
       <w:r>
-        <w:t>Best Research Paper Award, 9th IFToMM International Symposium on Robotics and Mechatronics — awarded for hybrid-actuated exoskeleton design (2026)</w:t>
+        <w:t>Best Research Paper Award, 9th IFToMM International Symposium on Robotics and Mechatronics | awarded for hybrid-actuated exoskeleton design (2026)</w:t>
       </w:r>
     </w:p>
     <w:p>
@@ -579,7 +579,7 @@
         <w:spacing w:after="40"/>
       </w:pPr>
       <w:r>
-        <w:t>TATA Technologies Innovation Award — INR 100,000 Grant (2019)</w:t>
+        <w:t>TATA Technologies Innovation Award | INR 100,000 Grant (2019)</w:t>
       </w:r>
     </w:p>
     <w:p>

</xml_diff>